<commit_message>
Rebuild the Word and PDF CVs to include arXiv:2608.30210
The Cursor agent that added the preprint (PR #1) rebuilt the text artifacts
correctly — a fresh build here matches them byte for byte — but not the
optional .docx and .pdf, which are only produced with --docx/--pdf. Both now
include the new entry.

The entry itself was verified against the arXiv API: title, all four authors
in order, posted 2026-08-31, cs.HC + cs.CV, 35 pp; the DOI and the benchmark
repository both resolve. The one field the API cannot confirm is
`corresponding: [Kim S]`.

Co-Authored-By: Claude Opus 5 <noreply@anthropic.com>
</commit_message>
<xml_diff>
--- a/build/CV_SunwhiKim.docx
+++ b/build/CV_SunwhiKim.docx
@@ -256,7 +256,7 @@
         <w:rPr>
           <w:sz w:val="19"/>
         </w:rPr>
-        <w:t>1. Kim S, Kim SY (2026) Human factors in detecting AI-generated portraits: age, sex, device, and confidence. arXiv, arXiv:2603.24048. doi:10.48550/arXiv.2603.24048 (Preprint)</w:t>
+        <w:t>1. Kim S†, Kim SY, Jo M, Tae J (2026) Frontier vision-language models have overtaken young adults at detecting AI-generated portraits — but not their calibration. arXiv, arXiv:2608.30210. doi:10.48550/arXiv.2608.30210 (Preprint)</w:t>
       </w:r>
     </w:p>
     <w:p>
@@ -267,7 +267,18 @@
         <w:rPr>
           <w:sz w:val="19"/>
         </w:rPr>
-        <w:t>2. Kim S†, Kim YE, Ujihara Y, Kim IH† (2024) Monosynaptically-interconnected network module (MNM) approach for high-resolution brain sub-network analysis. bioRxiv, 2024.02.19.581007. doi:10.1101/2024.02.19.581007 (Preprint)</w:t>
+        <w:t>2. Kim S, Kim SY (2026) Human factors in detecting AI-generated portraits: age, sex, device, and confidence. arXiv, arXiv:2603.24048. doi:10.48550/arXiv.2603.24048 (Preprint)</w:t>
+      </w:r>
+    </w:p>
+    <w:p>
+      <w:pPr>
+        <w:spacing w:after="60"/>
+      </w:pPr>
+      <w:r>
+        <w:rPr>
+          <w:sz w:val="19"/>
+        </w:rPr>
+        <w:t>3. Kim S†, Kim YE, Ujihara Y, Kim IH† (2024) Monosynaptically-interconnected network module (MNM) approach for high-resolution brain sub-network analysis. bioRxiv, 2024.02.19.581007. doi:10.1101/2024.02.19.581007 (Preprint)</w:t>
       </w:r>
     </w:p>
     <w:p>

</xml_diff>